<commit_message>
feat: add files in 'BM04' folder and add 'atestado04_2025'
</commit_message>
<xml_diff>
--- a/obras-arquivos/or0017-praca-nova-conc042025-geo/praca-nova-geral/ATESTADO04_2025.docx
+++ b/obras-arquivos/or0017-praca-nova-conc042025-geo/praca-nova-geral/ATESTADO04_2025.docx
@@ -1819,7 +1819,7 @@
                 <w:sz w:val="24"/>
                 <w:szCs w:val="24"/>
               </w:rPr>
-              <w:t>24</w:t>
+              <w:t>07</w:t>
             </w:r>
             <w:r>
               <w:rPr>
@@ -1839,7 +1839,17 @@
                 <w:sz w:val="24"/>
                 <w:szCs w:val="24"/>
               </w:rPr>
-              <w:t>07</w:t>
+              <w:t>0</w:t>
+            </w:r>
+            <w:r>
+              <w:rPr>
+                <w:rFonts w:ascii="Arial Narrow" w:hAnsi="Arial Narrow"/>
+                <w:b/>
+                <w:bCs/>
+                <w:sz w:val="24"/>
+                <w:szCs w:val="24"/>
+              </w:rPr>
+              <w:t>8</w:t>
             </w:r>
             <w:r>
               <w:rPr>
@@ -4194,6 +4204,9 @@
         <w:br/>
       </w:r>
       <w:r>
+        <w:rPr>
+          <w:noProof/>
+        </w:rPr>
         <w:drawing>
           <wp:inline distT="0" distB="0" distL="0" distR="0" wp14:anchorId="6B5EEF7B" wp14:editId="341627F6">
             <wp:extent cx="5906324" cy="6134956"/>
@@ -4407,6 +4420,9 @@
         <w:jc w:val="right"/>
       </w:pPr>
       <w:r>
+        <w:rPr>
+          <w:noProof/>
+        </w:rPr>
         <w:drawing>
           <wp:inline distT="0" distB="0" distL="0" distR="0" wp14:anchorId="52006824" wp14:editId="74A81DC4">
             <wp:extent cx="5906324" cy="4848902"/>
@@ -4683,6 +4699,9 @@
         <w:jc w:val="right"/>
       </w:pPr>
       <w:r>
+        <w:rPr>
+          <w:noProof/>
+        </w:rPr>
         <w:drawing>
           <wp:inline distT="0" distB="0" distL="0" distR="0" wp14:anchorId="46252A5F" wp14:editId="1AD74ED6">
             <wp:extent cx="5877745" cy="6068272"/>
@@ -4905,6 +4924,9 @@
         <w:jc w:val="right"/>
       </w:pPr>
       <w:r>
+        <w:rPr>
+          <w:noProof/>
+        </w:rPr>
         <w:drawing>
           <wp:inline distT="0" distB="0" distL="0" distR="0" wp14:anchorId="3B8935E1" wp14:editId="19E4C34B">
             <wp:extent cx="5877745" cy="4896533"/>
@@ -5181,6 +5203,9 @@
         <w:jc w:val="right"/>
       </w:pPr>
       <w:r>
+        <w:rPr>
+          <w:noProof/>
+        </w:rPr>
         <w:drawing>
           <wp:inline distT="0" distB="0" distL="0" distR="0" wp14:anchorId="09B2BF47" wp14:editId="2960CA9B">
             <wp:extent cx="5887272" cy="6335009"/>
@@ -5387,6 +5412,9 @@
         <w:jc w:val="right"/>
       </w:pPr>
       <w:r>
+        <w:rPr>
+          <w:noProof/>
+        </w:rPr>
         <w:drawing>
           <wp:inline distT="0" distB="0" distL="0" distR="0" wp14:anchorId="6BD8285D" wp14:editId="5E9163E8">
             <wp:extent cx="5868219" cy="4515480"/>
@@ -5649,6 +5677,9 @@
         <w:jc w:val="right"/>
       </w:pPr>
       <w:r>
+        <w:rPr>
+          <w:noProof/>
+        </w:rPr>
         <w:drawing>
           <wp:inline distT="0" distB="0" distL="0" distR="0" wp14:anchorId="6E7F239E" wp14:editId="1E86565E">
             <wp:extent cx="5868219" cy="5639587"/>
@@ -5857,6 +5888,9 @@
         <w:jc w:val="right"/>
       </w:pPr>
       <w:r>
+        <w:rPr>
+          <w:noProof/>
+        </w:rPr>
         <w:drawing>
           <wp:inline distT="0" distB="0" distL="0" distR="0" wp14:anchorId="583E789E" wp14:editId="6FA62514">
             <wp:extent cx="5887272" cy="5363323"/>
@@ -6074,6 +6108,9 @@
         <w:jc w:val="right"/>
       </w:pPr>
       <w:r>
+        <w:rPr>
+          <w:noProof/>
+        </w:rPr>
         <w:drawing>
           <wp:inline distT="0" distB="0" distL="0" distR="0" wp14:anchorId="03CEFF81" wp14:editId="372CB694">
             <wp:extent cx="5887272" cy="4067743"/>
@@ -6372,6 +6409,9 @@
         <w:jc w:val="right"/>
       </w:pPr>
       <w:r>
+        <w:rPr>
+          <w:noProof/>
+        </w:rPr>
         <w:drawing>
           <wp:inline distT="0" distB="0" distL="0" distR="0" wp14:anchorId="5DBFF753" wp14:editId="288003B8">
             <wp:extent cx="5906324" cy="4286848"/>

</xml_diff>